<commit_message>
Reframe brief as forward-looking proposal: status section -> system workflow
Replaces 'Approach' + 'Current Status & Timeline' with a single numbered
end-to-end System Workflow (foundry -> ingestion -> query -> evaluation ->
serving); mentorship ask softened to offer the implementation plan rather
than claim built artifacts.
</commit_message>
<xml_diff>
--- a/docs/MDR_Project_Brief.docx
+++ b/docs/MDR_Project_Brief.docx
@@ -104,7 +104,7 @@
     </w:p>
     <w:p>
       <w:r>
-        <w:t>Enterprise RAG systems are widely deployed but rarely evaluated honestly. On real corpora there is no ground truth for whether retrieval surfaced the right passages, whether a knowledge graph was extracted correctly, how much OCR noise damaged downstream answers, or whether access controls actually prevented information leakage. This project inverts the usual order: a seeded relational backbone (12 tables — employees, projects, budgets, contracts, systems) is generated first, and 100 realistic corporate documents are derived from it, so the truth is known before the system ever runs.</w:t>
+        <w:t>Enterprise RAG systems are widely deployed but rarely evaluated honestly. On real corpora there is no ground truth for whether retrieval surfaced the right passages, whether a knowledge graph was extracted correctly, how much OCR noise damaged downstream answers, or whether access controls actually prevented information leakage. This project inverts the usual order: the relational world is generated first and every document derived from it, so the truth is known before the system ever runs.</w:t>
       </w:r>
     </w:p>
     <w:p>
@@ -117,12 +117,12 @@
           <w:color w:val="1F3A5F"/>
           <w:sz w:val="20"/>
         </w:rPr>
-        <w:t>APPROACH</w:t>
+        <w:t>SYSTEM WORKFLOW</w:t>
       </w:r>
     </w:p>
     <w:p>
       <w:pPr>
-        <w:pStyle w:val="ListBullet"/>
+        <w:pStyle w:val="ListNumber"/>
         <w:spacing w:after="40"/>
       </w:pPr>
       <w:r>
@@ -132,52 +132,67 @@
         <w:t xml:space="preserve">Data foundry — </w:t>
       </w:r>
       <w:r>
-        <w:t>seeded synthetic tables (dbldatagen/PySpark) expanded into 100 LLM-written corporate documents, each with a machine-readable ground-truth sidecar (entities, relationships, answerable facts) and an aggregated true knowledge graph.</w:t>
+        <w:t>a seeded relational backbone (12 linked tables — employees, projects, budgets, contracts, systems) is generated with dbldatagen/PySpark; joined table contexts are written into 100 realistic corporate documents by an LLM, each shipping with a ground-truth sidecar (entities, relationships, answerable facts). Sidecars aggregate into the true knowledge graph and an 80-query test set.</w:t>
       </w:r>
     </w:p>
     <w:p>
       <w:pPr>
-        <w:pStyle w:val="ListBullet"/>
+        <w:pStyle w:val="ListNumber"/>
         <w:spacing w:after="40"/>
       </w:pPr>
       <w:r>
         <w:rPr>
           <w:b/>
         </w:rPr>
-        <w:t xml:space="preserve">Realistic ingestion — </w:t>
+        <w:t xml:space="preserve">Ingestion — </w:t>
       </w:r>
       <w:r>
-        <w:t>40% of the corpus is degraded into scan-like PDFs and recovered with GPU OCR; recovery quality is measured (character/word error rate, entity-survival rate) against ground truth.</w:t>
+        <w:t>60 documents remain clean digital PDFs; 40 are degraded into scan-like documents and recovered with GPU OCR, with recovery measured against ground truth (error rates, entity survival). All text is chunked, enriched with contextual summaries, embedded (bge-m3), and indexed three ways: vector database (Qdrant), BM25 keyword index, and a knowledge graph.</w:t>
       </w:r>
     </w:p>
     <w:p>
       <w:pPr>
-        <w:pStyle w:val="ListBullet"/>
+        <w:pStyle w:val="ListNumber"/>
         <w:spacing w:after="40"/>
       </w:pPr>
       <w:r>
         <w:rPr>
           <w:b/>
         </w:rPr>
-        <w:t xml:space="preserve">Agentic query pipeline — </w:t>
+        <w:t xml:space="preserve">Query time — </w:t>
       </w:r>
       <w:r>
-        <w:t>a nine-node LangGraph agent: domain routing, attribute-based access control (ABAC), hybrid dense+BM25 retrieval with cross-encoder re-ranking, corrective retrieval (CRAG), knowledge-graph multi-hop augmentation (GraphRAG), and grounded generation with confidence-aware abstention.</w:t>
+        <w:t>a nine-node LangGraph agent handles each question: access-control filter (ABAC) → domain routing → hybrid dense+keyword retrieval → cross-encoder re-ranking → corrective chunk grading (CRAG) with bounded retry → knowledge-graph multi-hop augmentation (GraphRAG) → grounded generation on a local open-weight model (Qwen3-4B) → hallucination check with honest abstention. Every node is timed and traced.</w:t>
       </w:r>
     </w:p>
     <w:p>
       <w:pPr>
-        <w:pStyle w:val="ListBullet"/>
+        <w:pStyle w:val="ListNumber"/>
         <w:spacing w:after="40"/>
       </w:pPr>
       <w:r>
         <w:rPr>
           <w:b/>
         </w:rPr>
-        <w:t xml:space="preserve">Local inference — </w:t>
+        <w:t xml:space="preserve">Evaluation — </w:t>
       </w:r>
       <w:r>
-        <w:t>query-time models are open-weight (Qwen3-4B, bge-m3) on commodity hardware; paid APIs are used only one-off during ingestion (under A$10 total).</w:t>
+        <w:t>the same 80 queries run across six ablation configurations, measuring each component's contribution in isolation (details below).</w:t>
+      </w:r>
+    </w:p>
+    <w:p>
+      <w:pPr>
+        <w:pStyle w:val="ListNumber"/>
+        <w:spacing w:after="40"/>
+      </w:pPr>
+      <w:r>
+        <w:rPr>
+          <w:b/>
+        </w:rPr>
+        <w:t xml:space="preserve">Serving — </w:t>
+      </w:r>
+      <w:r>
+        <w:t>the system deploys with Docker on Oracle Cloud's free tier behind a React dashboard exposing the live agent trace, a corpus explorer, the knowledge graph, and an evaluation lab — delivered on a 10-week phased plan.</w:t>
       </w:r>
     </w:p>
     <w:p>
@@ -263,30 +278,12 @@
           <w:color w:val="1F3A5F"/>
           <w:sz w:val="20"/>
         </w:rPr>
-        <w:t>CURRENT STATUS &amp; TIMELINE</w:t>
-      </w:r>
-    </w:p>
-    <w:p>
-      <w:r>
-        <w:t>Phase 1 of 7 is complete and machine-validated: the seeded data foundry, 100 documents with ground-truth sidecars, the true knowledge graph (321 nodes / 358 edges), the 80-query evaluation set, and rendered PDFs — all passing an automated 11-check validation suite that gates progress between phases. The remaining phases (OCR ingestion, indexing, the agent pipeline, evaluation, dashboard, and public cloud deployment with a live demo) follow a 10-week plan.</w:t>
-      </w:r>
-    </w:p>
-    <w:p>
-      <w:pPr>
-        <w:spacing w:before="140" w:after="40"/>
-      </w:pPr>
-      <w:r>
-        <w:rPr>
-          <w:b/>
-          <w:color w:val="1F3A5F"/>
-          <w:sz w:val="20"/>
-        </w:rPr>
         <w:t>MENTORSHIP REQUEST</w:t>
       </w:r>
     </w:p>
     <w:p>
       <w:r>
-        <w:t>We are seeking academic mentorship: guidance on the evaluation methodology, feedback on framing the work for an academic audience, and periodic review as phases complete. The repository — code, validation suite, and all artifacts — and a live demo are available on request. We would welcome the opportunity to present the project in person.</w:t>
+        <w:t>We are seeking academic mentorship: guidance on the evaluation methodology, feedback on framing the work for an academic audience, and periodic review as the build progresses. A detailed implementation plan — architecture, decision log, and evaluation design — is available on request, and we would welcome the opportunity to present it in person.</w:t>
       </w:r>
     </w:p>
     <w:sectPr>

</xml_diff>

<commit_message>
Reframe brief Problem & Motivation: system-first, measurability as support
Problem now leads with the real engineering challenge (accurate,
access-governed answers over siloed, partly-scanned enterprise documents)
rather than 'RAG can't be evaluated honestly' — synthetic ground truth
becomes the closing credibility beat, not the headline. Summary harmonized
to match. Dropped the redundant Evaluation step from System Workflow (the
dedicated Evaluation Methodology section already covers it) to hold one page.
</commit_message>
<xml_diff>
--- a/docs/MDR_Project_Brief.docx
+++ b/docs/MDR_Project_Brief.docx
@@ -86,7 +86,7 @@
     </w:p>
     <w:p>
       <w:r>
-        <w:t>We are building a production-pattern, enterprise-grade Retrieval-Augmented Generation (RAG) system that answers questions over a four-domain corporate corpus (Finance, HR, Legal, Engineering). The corpus is fully synthetic and fully ground-truthed: because we generate the underlying relational world first, every document, entity, relationship, and test query has a known correct answer — enabling a standard of evaluation rigor that real-world corpora cannot offer.</w:t>
+        <w:t>We are building a production-pattern, enterprise-grade Retrieval-Augmented Generation (RAG) system that delivers accurate, access-governed answers over a four-domain corporate corpus (Finance, HR, Legal, Engineering). Because the corpus is synthetic and generated from a known relational backbone, every document, entity, and relationship has a ground-truth answer — letting us verify that the system is accurate and leak-free to a degree real-world deployments cannot.</w:t>
       </w:r>
     </w:p>
     <w:p>
@@ -104,7 +104,7 @@
     </w:p>
     <w:p>
       <w:r>
-        <w:t>Enterprise RAG systems are widely deployed but rarely evaluated honestly. On real corpora there is no ground truth for whether retrieval surfaced the right passages, whether a knowledge graph was extracted correctly, how much OCR noise damaged downstream answers, or whether access controls actually prevented information leakage. This project inverts the usual order: the relational world is generated first and every document derived from it, so the truth is known before the system ever runs.</w:t>
+        <w:t>Enterprise knowledge is split across departments — finance, HR, legal, engineering — each with its own jargon and strict rules on who may see what, and much of it lives in scanned files rather than clean text. A trustworthy answer to a question that spans these silos must retrieve the right passages, reason across documents, respect every access boundary, and abstain when the evidence is absent. RAG systems struggle on all four fronts, and real corpora carry no ground truth to measure where they fail. We build a multi-domain agentic RAG system engineered for accuracy and governed access, over a corpus we generate ourselves so that every passage, relationship, and access decision can be verified against known truth.</w:t>
       </w:r>
     </w:p>
     <w:p>
@@ -132,7 +132,7 @@
         <w:t xml:space="preserve">Data foundry — </w:t>
       </w:r>
       <w:r>
-        <w:t>a seeded relational backbone (12 linked tables — employees, projects, budgets, contracts, systems) is generated with dbldatagen/PySpark; joined table contexts are written into 100 realistic corporate documents by an LLM, each shipping with a ground-truth sidecar (entities, relationships, answerable facts). Sidecars aggregate into the true knowledge graph and an 80-query test set.</w:t>
+        <w:t>a seeded relational backbone of 12 linked tables is generated with dbldatagen; joined table contexts become 100 LLM-written corporate documents, each carrying a ground-truth sidecar (entities, relationships, answerable facts). Sidecars aggregate into the true knowledge graph and an 80-query test set.</w:t>
       </w:r>
     </w:p>
     <w:p>
@@ -147,7 +147,7 @@
         <w:t xml:space="preserve">Ingestion — </w:t>
       </w:r>
       <w:r>
-        <w:t>60 documents remain clean digital PDFs; 40 are degraded into scan-like documents and recovered with GPU OCR, with recovery measured against ground truth (error rates, entity survival). All text is chunked, enriched with contextual summaries, embedded (bge-m3), and indexed three ways: vector database (Qdrant), BM25 keyword index, and a knowledge graph.</w:t>
+        <w:t>60 documents stay clean digital PDFs; 40 are degraded into scan-like images and recovered with GPU OCR, recovery measured against ground truth (error rates, entity survival). All text is chunked, contextualized, embedded (bge-m3), and indexed three ways — vectors (Qdrant), BM25, and a knowledge graph.</w:t>
       </w:r>
     </w:p>
     <w:p>
@@ -162,22 +162,7 @@
         <w:t xml:space="preserve">Query time — </w:t>
       </w:r>
       <w:r>
-        <w:t>a nine-node LangGraph agent handles each question: access-control filter (ABAC) → domain routing → hybrid dense+keyword retrieval → cross-encoder re-ranking → corrective chunk grading (CRAG) with bounded retry → knowledge-graph multi-hop augmentation (GraphRAG) → grounded generation on a local open-weight model (Qwen3-4B) → hallucination check with honest abstention. Every node is timed and traced.</w:t>
-      </w:r>
-    </w:p>
-    <w:p>
-      <w:pPr>
-        <w:pStyle w:val="ListNumber"/>
-        <w:spacing w:after="40"/>
-      </w:pPr>
-      <w:r>
-        <w:rPr>
-          <w:b/>
-        </w:rPr>
-        <w:t xml:space="preserve">Evaluation — </w:t>
-      </w:r>
-      <w:r>
-        <w:t>the same 80 queries run across six ablation configurations, measuring each component's contribution in isolation (details below).</w:t>
+        <w:t>a nine-node LangGraph agent handles each question: access-control filter (ABAC) → domain routing → hybrid dense+keyword retrieval → cross-encoder re-ranking → corrective chunk grading (CRAG) with bounded retry → knowledge-graph multi-hop augmentation (GraphRAG) → grounded local generation (Qwen3-4B) → hallucination check with honest abstention — every node traced.</w:t>
       </w:r>
     </w:p>
     <w:p>

</xml_diff>